<commit_message>
Update February 2026: fix truncated abstract for gestational antidepressant exposure article
Co-Authored-By: Claude Opus 4.6 (1M context) <noreply@anthropic.com>
</commit_message>
<xml_diff>
--- a/docs/PPU February 2026.docx
+++ b/docs/PPU February 2026.docx
@@ -2927,20 +2927,36 @@
     </w:p>
     <w:p>
       <w:pPr>
-        <w:pStyle w:val="NormalWeb"/>
-        <w:shd w:val="clear" w:color="auto" w:fill="FFFFFF"/>
-      </w:pPr>
-      <w:r>
-        <w:rPr>
-          <w:rFonts w:ascii="Segoe UI" w:hAnsi="Segoe UI" w:cs="Segoe UI"/>
-          <w:color w:val="212121"/>
+        <w:shd w:val="clear" w:color="auto" w:fill="FFFFFF"/>
+        <w:spacing w:after="0" w:line="240" w:lineRule="auto"/>
+        <w:rPr>
+          <w:rFonts w:ascii="Segoe UI" w:hAnsi="Segoe UI" w:cs="Segoe UI"/>
+        </w:rPr>
+      </w:pPr>
+    </w:p>
+    <w:p>
+      <w:pPr>
+        <w:shd w:val="clear" w:color="auto" w:fill="FFFFFF"/>
+        <w:spacing w:after="0" w:line="240" w:lineRule="auto"/>
+        <w:rPr>
+          <w:rFonts w:ascii="Segoe UI" w:hAnsi="Segoe UI" w:cs="Segoe UI"/>
+          <w:sz w:val="24"/>
+          <w:szCs w:val="24"/>
+        </w:rPr>
+      </w:pPr>
+      <w:r>
+        <w:rPr>
+          <w:rFonts w:ascii="Segoe UI" w:hAnsi="Segoe UI" w:cs="Segoe UI"/>
+          <w:sz w:val="24"/>
+          <w:szCs w:val="24"/>
         </w:rPr>
         <w:t xml:space="preserve">Untreated depression may adversely affect pregnancy and offspring outcomes through several mechanisms; on the flip side, antidepressants used to treat depression may cross the placenta and affect the developing fetus and its brain. This article examines the research literature on gestational exposure to antidepressants and the risk of neurodevelopmental disorders (NDDs) in offspring. Two recent meta-analyses and 3 subsequently published observational studies, including 1 Asian study, are reviewed with especial focus on autism spectrum disorder (ASD) and attention-deficit/hyperactivity disorder (ADHD). Despite limitations of the literature, some conclusions can reasonably </w:t>
       </w:r>
       <w:r>
         <w:rPr>
           <w:rFonts w:ascii="Segoe UI" w:hAnsi="Segoe UI" w:cs="Segoe UI"/>
-          <w:color w:val="212121"/>
+          <w:sz w:val="24"/>
+          <w:szCs w:val="24"/>
         </w:rPr>
         <w:lastRenderedPageBreak/>
         <w:t xml:space="preserve">be drawn. In unadjusted analyses, which assist an understanding of </w:t>
@@ -2949,7 +2965,8 @@
       <w:r>
         <w:rPr>
           <w:rFonts w:ascii="Segoe UI" w:hAnsi="Segoe UI" w:cs="Segoe UI"/>
-          <w:color w:val="212121"/>
+          <w:sz w:val="24"/>
+          <w:szCs w:val="24"/>
         </w:rPr>
         <w:t>real world</w:t>
       </w:r>
@@ -2957,15 +2974,93 @@
       <w:r>
         <w:rPr>
           <w:rFonts w:ascii="Segoe UI" w:hAnsi="Segoe UI" w:cs="Segoe UI"/>
-          <w:color w:val="212121"/>
-        </w:rPr>
-        <w:t xml:space="preserve"> risks, gestational exposure to antidepressant drugs is associated with an up to doubled risk of ASD and ADHD.</w:t>
-      </w:r>
-    </w:p>
-    <w:p>
-      <w:pPr>
-        <w:shd w:val="clear" w:color="auto" w:fill="FFFFFF"/>
-        <w:spacing w:after="0" w:line="240" w:lineRule="auto"/>
+          <w:sz w:val="24"/>
+          <w:szCs w:val="24"/>
+        </w:rPr>
+        <w:t xml:space="preserve"> risks, gestational exposure to antidepressant drugs is associated with an up to doubled risk of ASD and ADHD. However, in adjusted analyses, which assist an understanding of cause-effect relationships but not </w:t>
+      </w:r>
+      <w:proofErr w:type="gramStart"/>
+      <w:r>
+        <w:rPr>
+          <w:rFonts w:ascii="Segoe UI" w:hAnsi="Segoe UI" w:cs="Segoe UI"/>
+          <w:sz w:val="24"/>
+          <w:szCs w:val="24"/>
+        </w:rPr>
+        <w:t>real world</w:t>
+      </w:r>
+      <w:proofErr w:type="gramEnd"/>
+      <w:r>
+        <w:rPr>
+          <w:rFonts w:ascii="Segoe UI" w:hAnsi="Segoe UI" w:cs="Segoe UI"/>
+          <w:sz w:val="24"/>
+          <w:szCs w:val="24"/>
+        </w:rPr>
+        <w:t xml:space="preserve"> risks, the risks substantially attenuate and may lose statistical significance. The risks also lose statistical significance in analyses that address confounding by indication by comparing antidepressant-exposed and -unexposed pregnancies in women with psychiatric disorders. The likelihood of confounding by parental genes, parental environment, and parental health-related variables is suggested by findings that antidepressants remain significantly associated with NDDs when the exposure period is outside the pregnancy window (such as before or after but not during pregnancy) or when fathers are exposed to antidepressants during pregnancy. Finally, discordant sibling pair analyses suggest that </w:t>
+      </w:r>
+      <w:proofErr w:type="gramStart"/>
+      <w:r>
+        <w:rPr>
+          <w:rFonts w:ascii="Segoe UI" w:hAnsi="Segoe UI" w:cs="Segoe UI"/>
+          <w:sz w:val="24"/>
+          <w:szCs w:val="24"/>
+        </w:rPr>
+        <w:t>whether or not</w:t>
+      </w:r>
+      <w:proofErr w:type="gramEnd"/>
+      <w:r>
+        <w:rPr>
+          <w:rFonts w:ascii="Segoe UI" w:hAnsi="Segoe UI" w:cs="Segoe UI"/>
+          <w:sz w:val="24"/>
+          <w:szCs w:val="24"/>
+        </w:rPr>
+        <w:t xml:space="preserve"> a child develops an NDD is related to </w:t>
+      </w:r>
+      <w:proofErr w:type="gramStart"/>
+      <w:r>
+        <w:rPr>
+          <w:rFonts w:ascii="Segoe UI" w:hAnsi="Segoe UI" w:cs="Segoe UI"/>
+          <w:sz w:val="24"/>
+          <w:szCs w:val="24"/>
+        </w:rPr>
+        <w:t>whether or not</w:t>
+      </w:r>
+      <w:proofErr w:type="gramEnd"/>
+      <w:r>
+        <w:rPr>
+          <w:rFonts w:ascii="Segoe UI" w:hAnsi="Segoe UI" w:cs="Segoe UI"/>
+          <w:sz w:val="24"/>
+          <w:szCs w:val="24"/>
+        </w:rPr>
+        <w:t xml:space="preserve"> its sib has an NDD rather than </w:t>
+      </w:r>
+      <w:proofErr w:type="gramStart"/>
+      <w:r>
+        <w:rPr>
+          <w:rFonts w:ascii="Segoe UI" w:hAnsi="Segoe UI" w:cs="Segoe UI"/>
+          <w:sz w:val="24"/>
+          <w:szCs w:val="24"/>
+        </w:rPr>
+        <w:t>whether or not</w:t>
+      </w:r>
+      <w:proofErr w:type="gramEnd"/>
+      <w:r>
+        <w:rPr>
+          <w:rFonts w:ascii="Segoe UI" w:hAnsi="Segoe UI" w:cs="Segoe UI"/>
+          <w:sz w:val="24"/>
+          <w:szCs w:val="24"/>
+        </w:rPr>
+        <w:t xml:space="preserve"> the child was exposed to an antidepressant in utero. Discussion points are suggested for the shared decision-making process when counseling women about NDD risks associated with gestational exposure to antidepressant drugs. Take-home messages are summarized.</w:t>
+      </w:r>
+    </w:p>
+    <w:p>
+      <w:pPr>
+        <w:shd w:val="clear" w:color="auto" w:fill="FFFFFF"/>
+        <w:spacing w:after="0" w:line="240" w:lineRule="auto"/>
+        <w:rPr>
+          <w:rFonts w:ascii="Segoe UI" w:hAnsi="Segoe UI" w:cs="Segoe UI"/>
+          <w:sz w:val="24"/>
+          <w:szCs w:val="24"/>
+        </w:rPr>
       </w:pPr>
     </w:p>
     <w:p>
@@ -3185,6 +3280,7 @@
           <w:rFonts w:ascii="Segoe UI" w:hAnsi="Segoe UI" w:cs="Segoe UI"/>
           <w:color w:val="212121"/>
         </w:rPr>
+        <w:lastRenderedPageBreak/>
         <w:t xml:space="preserve">Participants: </w:t>
       </w:r>
       <w:r>
@@ -3280,7 +3376,191 @@
           <w:rFonts w:ascii="Segoe UI" w:hAnsi="Segoe UI" w:cs="Segoe UI"/>
           <w:color w:val="212121"/>
         </w:rPr>
-        <w:t xml:space="preserve"> participants were female and were taking concomitant psychotropic medications (antidepressants and antipsychotics) at baseline. Study participants were moderately agitated at baseline, were diverse in ethnic background (9% Black, 11% Hispanic/Latina/Latino), and had severe cognitive impairment evidenced </w:t>
+        <w:t xml:space="preserve"> participants were female and were taking concomitant psychotropic medications (antidepressants and antipsychotics) at baseline. Study participants were moderately agitated at baseline, were diverse in ethnic background (9% Black, 11% Hispanic/Latina/Latino), and had severe cognitive impairment evidenced by MMSE or SIB-8. 84% completed the 3-week trial. Dronabinol decreased agitation on both primary outcomes greater than placebo to a clinically relevant extent. The fitted between-arm difference in PAS decline/week was -0.74 (SE 0.3, p = 0.015, effect size = 0.53) and for NPI-C A/A the decline was not significant at -1.26 (SE 0.67, p = 0.094, effect size = 0.36).</w:t>
+      </w:r>
+    </w:p>
+    <w:p>
+      <w:pPr>
+        <w:pStyle w:val="NormalWeb"/>
+        <w:shd w:val="clear" w:color="auto" w:fill="FFFFFF"/>
+      </w:pPr>
+      <w:r>
+        <w:rPr>
+          <w:rStyle w:val="Strong"/>
+          <w:rFonts w:ascii="Segoe UI" w:hAnsi="Segoe UI" w:cs="Segoe UI"/>
+          <w:color w:val="212121"/>
+        </w:rPr>
+        <w:t xml:space="preserve">Conclusions: </w:t>
+      </w:r>
+      <w:r>
+        <w:rPr>
+          <w:rFonts w:ascii="Segoe UI" w:hAnsi="Segoe UI" w:cs="Segoe UI"/>
+          <w:color w:val="212121"/>
+        </w:rPr>
+        <w:t>and relevance: Adjunctive dronabinol treatment was safe and effective for treating agitation in AD.</w:t>
+      </w:r>
+    </w:p>
+    <w:p>
+      <w:pPr>
+        <w:pStyle w:val="NormalWeb"/>
+        <w:shd w:val="clear" w:color="auto" w:fill="FFFFFF"/>
+      </w:pPr>
+      <w:r>
+        <w:rPr>
+          <w:rStyle w:val="Strong"/>
+          <w:rFonts w:ascii="Segoe UI" w:hAnsi="Segoe UI" w:cs="Segoe UI"/>
+          <w:color w:val="212121"/>
+        </w:rPr>
+        <w:t xml:space="preserve">Clinical trials registration: </w:t>
+      </w:r>
+      <w:r>
+        <w:rPr>
+          <w:rFonts w:ascii="Segoe UI" w:hAnsi="Segoe UI" w:cs="Segoe UI"/>
+          <w:color w:val="212121"/>
+        </w:rPr>
+        <w:t>NCT02792257.</w:t>
+      </w:r>
+    </w:p>
+    <w:p>
+      <w:pPr>
+        <w:shd w:val="clear" w:color="auto" w:fill="FFFFFF"/>
+        <w:spacing w:after="0" w:line="240" w:lineRule="auto"/>
+      </w:pPr>
+    </w:p>
+    <w:p>
+      <w:pPr>
+        <w:pStyle w:val="Heading1"/>
+        <w:shd w:val="clear" w:color="auto" w:fill="FFFFFF"/>
+      </w:pPr>
+      <w:r>
+        <w:rPr>
+          <w:rFonts w:ascii="Merriweather" w:hAnsi="Merriweather"/>
+          <w:color w:val="212121"/>
+        </w:rPr>
+        <w:t>Antibiomania: A Systematic Review of Clarithromycin-Associated Manic Episodes</w:t>
+      </w:r>
+    </w:p>
+    <w:p>
+      <w:pPr>
+        <w:shd w:val="clear" w:color="auto" w:fill="FFFFFF"/>
+        <w:spacing w:after="0" w:line="240" w:lineRule="auto"/>
+      </w:pPr>
+      <w:r>
+        <w:rPr>
+          <w:rFonts w:ascii="Segoe UI" w:hAnsi="Segoe UI" w:cs="Segoe UI"/>
+          <w:color w:val="212121"/>
+        </w:rPr>
+        <w:t xml:space="preserve">Marković T, Todorović A, Stojković M, Popović S, </w:t>
+      </w:r>
+      <w:proofErr w:type="spellStart"/>
+      <w:r>
+        <w:rPr>
+          <w:rFonts w:ascii="Segoe UI" w:hAnsi="Segoe UI" w:cs="Segoe UI"/>
+          <w:color w:val="212121"/>
+        </w:rPr>
+        <w:t>Baskić</w:t>
+      </w:r>
+      <w:proofErr w:type="spellEnd"/>
+      <w:r>
+        <w:rPr>
+          <w:rFonts w:ascii="Segoe UI" w:hAnsi="Segoe UI" w:cs="Segoe UI"/>
+          <w:color w:val="212121"/>
+        </w:rPr>
+        <w:t xml:space="preserve"> D, Matić S. </w:t>
+      </w:r>
+      <w:proofErr w:type="spellStart"/>
+      <w:r>
+        <w:rPr>
+          <w:rFonts w:ascii="Segoe UI" w:hAnsi="Segoe UI" w:cs="Segoe UI"/>
+          <w:color w:val="212121"/>
+        </w:rPr>
+        <w:t>Antibiomania</w:t>
+      </w:r>
+      <w:proofErr w:type="spellEnd"/>
+      <w:r>
+        <w:rPr>
+          <w:rFonts w:ascii="Segoe UI" w:hAnsi="Segoe UI" w:cs="Segoe UI"/>
+          <w:color w:val="212121"/>
+        </w:rPr>
+        <w:t xml:space="preserve">: A Systematic Review of Clarithromycin-Associated Manic Episodes. J Clin </w:t>
+      </w:r>
+      <w:proofErr w:type="spellStart"/>
+      <w:r>
+        <w:rPr>
+          <w:rFonts w:ascii="Segoe UI" w:hAnsi="Segoe UI" w:cs="Segoe UI"/>
+          <w:color w:val="212121"/>
+        </w:rPr>
+        <w:t>Psychopharmacol</w:t>
+      </w:r>
+      <w:proofErr w:type="spellEnd"/>
+      <w:r>
+        <w:rPr>
+          <w:rFonts w:ascii="Segoe UI" w:hAnsi="Segoe UI" w:cs="Segoe UI"/>
+          <w:color w:val="212121"/>
+        </w:rPr>
+        <w:t xml:space="preserve">. 2026;46(1):82-92. </w:t>
+      </w:r>
+      <w:proofErr w:type="spellStart"/>
+      <w:r>
+        <w:rPr>
+          <w:rFonts w:ascii="Segoe UI" w:hAnsi="Segoe UI" w:cs="Segoe UI"/>
+          <w:color w:val="212121"/>
+        </w:rPr>
+        <w:t>doi</w:t>
+      </w:r>
+      <w:proofErr w:type="spellEnd"/>
+      <w:r>
+        <w:rPr>
+          <w:rFonts w:ascii="Segoe UI" w:hAnsi="Segoe UI" w:cs="Segoe UI"/>
+          <w:color w:val="212121"/>
+        </w:rPr>
+        <w:t xml:space="preserve">: 10.1097/JCP.0000000000002089 </w:t>
+      </w:r>
+      <w:hyperlink r:id="rId36" w:history="1">
+        <w:r>
+          <w:rPr>
+            <w:rStyle w:val="Hyperlink"/>
+            <w:rFonts w:ascii="Segoe UI" w:hAnsi="Segoe UI" w:cs="Segoe UI"/>
+          </w:rPr>
+          <w:t>DOI link</w:t>
+        </w:r>
+      </w:hyperlink>
+      <w:r>
+        <w:rPr>
+          <w:rFonts w:ascii="Segoe UI" w:hAnsi="Segoe UI" w:cs="Segoe UI"/>
+          <w:color w:val="212121"/>
+        </w:rPr>
+        <w:t>.</w:t>
+      </w:r>
+    </w:p>
+    <w:p>
+      <w:pPr>
+        <w:pStyle w:val="NormalWeb"/>
+        <w:shd w:val="clear" w:color="auto" w:fill="FFFFFF"/>
+      </w:pPr>
+      <w:r>
+        <w:rPr>
+          <w:rStyle w:val="Strong"/>
+          <w:rFonts w:ascii="Segoe UI" w:hAnsi="Segoe UI" w:cs="Segoe UI"/>
+          <w:color w:val="212121"/>
+        </w:rPr>
+        <w:t xml:space="preserve">Purpose: </w:t>
+      </w:r>
+      <w:proofErr w:type="spellStart"/>
+      <w:r>
+        <w:rPr>
+          <w:rFonts w:ascii="Segoe UI" w:hAnsi="Segoe UI" w:cs="Segoe UI"/>
+          <w:color w:val="212121"/>
+        </w:rPr>
+        <w:t>Antibiomania</w:t>
+      </w:r>
+      <w:proofErr w:type="spellEnd"/>
+      <w:r>
+        <w:rPr>
+          <w:rFonts w:ascii="Segoe UI" w:hAnsi="Segoe UI" w:cs="Segoe UI"/>
+          <w:color w:val="212121"/>
+        </w:rPr>
+        <w:t xml:space="preserve">, a rare adverse reaction, refers to antibiotic-induced mania, with clarithromycin most frequently implicated. Symptoms include mood elevation, hyperactivity, and hallucinations, typically resolving after discontinuation of the drug. This review examines reported cases to better characterize clinical patterns and guide clinical recognition and management. Methods: A systematic review was conducted following PRISMA guidelines and registered with PROSPERO. Literature searches were performed in PubMed/MEDLINE, Web of Science, Scopus, and EMBASE using keywords related to clarithromycin, mania, and psychosis. Studies were included regardless of </w:t>
       </w:r>
       <w:r>
         <w:rPr>
@@ -3288,7 +3568,135 @@
           <w:color w:val="212121"/>
         </w:rPr>
         <w:lastRenderedPageBreak/>
-        <w:t>by MMSE or SIB-8. 84% completed the 3-week trial. Dronabinol decreased agitation on both primary outcomes greater than placebo to a clinically relevant extent. The fitted between-arm difference in PAS decline/week was -0.74 (SE 0.3, p = 0.015, effect size = 0.53) and for NPI-C A/A the decline was not significant at -1.26 (SE 0.67, p = 0.094, effect size = 0.36).</w:t>
+        <w:t xml:space="preserve">language or publication date. Data extraction focused on demographic details, clinical presentation, treatment, and causality assessment. The quality of case reports was assessed using standardized criteria. FAERS and </w:t>
+      </w:r>
+      <w:proofErr w:type="spellStart"/>
+      <w:r>
+        <w:rPr>
+          <w:rFonts w:ascii="Segoe UI" w:hAnsi="Segoe UI" w:cs="Segoe UI"/>
+          <w:color w:val="212121"/>
+        </w:rPr>
+        <w:t>EudraVigilance</w:t>
+      </w:r>
+      <w:proofErr w:type="spellEnd"/>
+      <w:r>
+        <w:rPr>
+          <w:rFonts w:ascii="Segoe UI" w:hAnsi="Segoe UI" w:cs="Segoe UI"/>
+          <w:color w:val="212121"/>
+        </w:rPr>
+        <w:t xml:space="preserve"> databases were queried to identify spontaneously reported psychiatric adverse events associated with clarithromycin. Results: A total of 32 studies involving 34 patients were included. Most patients were under 65 years old, with a nearly equal distribution of genders. Manic episodes often included psychotic symptoms and emerged ~4 days after the initiation of clarithromycin, lasting about 3 days. The most common dosage was 500mg taken twice daily. Rechallenge in 5 cases consistently reproduced the symptoms. Causality assessment using the Naranjo and WHO-UMC score suggested a probable association in most cases. All patients fully recovered after discontinuation. Conclusions: Clarithromycin may trigger secondary mania, emphasizing the need for clinician awareness of this rare psychiatric side effect. Timely recognition and appropriate management can enhance patient outcomes and prevent unnecessary psychiatric interventions.</w:t>
+      </w:r>
+    </w:p>
+    <w:p>
+      <w:pPr>
+        <w:shd w:val="clear" w:color="auto" w:fill="FFFFFF"/>
+        <w:spacing w:after="0" w:line="240" w:lineRule="auto"/>
+      </w:pPr>
+    </w:p>
+    <w:p>
+      <w:pPr>
+        <w:pStyle w:val="Heading1"/>
+        <w:shd w:val="clear" w:color="auto" w:fill="FFFFFF"/>
+      </w:pPr>
+      <w:r>
+        <w:rPr>
+          <w:rFonts w:ascii="Merriweather" w:hAnsi="Merriweather"/>
+          <w:color w:val="212121"/>
+        </w:rPr>
+        <w:t>Spirituality and Harmful or Hazardous Alcohol and Other Drug Use: A Meta-Analysis of Longitudinal Studies</w:t>
+      </w:r>
+    </w:p>
+    <w:p>
+      <w:pPr>
+        <w:shd w:val="clear" w:color="auto" w:fill="FFFFFF"/>
+        <w:spacing w:after="0" w:line="240" w:lineRule="auto"/>
+      </w:pPr>
+      <w:r>
+        <w:rPr>
+          <w:rFonts w:ascii="Segoe UI" w:hAnsi="Segoe UI" w:cs="Segoe UI"/>
+          <w:color w:val="212121"/>
+        </w:rPr>
+        <w:t xml:space="preserve">Koh HK, Frederick DE, Balboni TA, O'Reilly SM, Kelly JF, Humphreys K, et al. Spirituality and Harmful or Hazardous Alcohol and Other Drug Use: A Meta-Analysis of Longitudinal Studies. JAMA Psychiatry. 2026 Feb </w:t>
+      </w:r>
+      <w:proofErr w:type="gramStart"/>
+      <w:r>
+        <w:rPr>
+          <w:rFonts w:ascii="Segoe UI" w:hAnsi="Segoe UI" w:cs="Segoe UI"/>
+          <w:color w:val="212121"/>
+        </w:rPr>
+        <w:t>18:e</w:t>
+      </w:r>
+      <w:proofErr w:type="gramEnd"/>
+      <w:r>
+        <w:rPr>
+          <w:rFonts w:ascii="Segoe UI" w:hAnsi="Segoe UI" w:cs="Segoe UI"/>
+          <w:color w:val="212121"/>
+        </w:rPr>
+        <w:t xml:space="preserve">254816. </w:t>
+      </w:r>
+      <w:proofErr w:type="spellStart"/>
+      <w:r>
+        <w:rPr>
+          <w:rFonts w:ascii="Segoe UI" w:hAnsi="Segoe UI" w:cs="Segoe UI"/>
+          <w:color w:val="212121"/>
+        </w:rPr>
+        <w:t>doi</w:t>
+      </w:r>
+      <w:proofErr w:type="spellEnd"/>
+      <w:r>
+        <w:rPr>
+          <w:rFonts w:ascii="Segoe UI" w:hAnsi="Segoe UI" w:cs="Segoe UI"/>
+          <w:color w:val="212121"/>
+        </w:rPr>
+        <w:t xml:space="preserve">: 10.1001/jamapsychiatry.2025.4816. </w:t>
+      </w:r>
+      <w:proofErr w:type="spellStart"/>
+      <w:r>
+        <w:rPr>
+          <w:rFonts w:ascii="Segoe UI" w:hAnsi="Segoe UI" w:cs="Segoe UI"/>
+          <w:color w:val="212121"/>
+        </w:rPr>
+        <w:t>Epub</w:t>
+      </w:r>
+      <w:proofErr w:type="spellEnd"/>
+      <w:r>
+        <w:rPr>
+          <w:rFonts w:ascii="Segoe UI" w:hAnsi="Segoe UI" w:cs="Segoe UI"/>
+          <w:color w:val="212121"/>
+        </w:rPr>
+        <w:t xml:space="preserve"> ahead of print</w:t>
+      </w:r>
+      <w:proofErr w:type="gramStart"/>
+      <w:r>
+        <w:rPr>
+          <w:rFonts w:ascii="Segoe UI" w:hAnsi="Segoe UI" w:cs="Segoe UI"/>
+          <w:color w:val="212121"/>
+        </w:rPr>
+        <w:t>. ;</w:t>
+      </w:r>
+      <w:proofErr w:type="gramEnd"/>
+      <w:r>
+        <w:rPr>
+          <w:rFonts w:ascii="Segoe UI" w:hAnsi="Segoe UI" w:cs="Segoe UI"/>
+          <w:color w:val="212121"/>
+        </w:rPr>
+        <w:t xml:space="preserve"> PMCID: PMC12917744 </w:t>
+      </w:r>
+      <w:hyperlink r:id="rId37" w:history="1">
+        <w:r>
+          <w:rPr>
+            <w:rStyle w:val="Hyperlink"/>
+            <w:rFonts w:ascii="Segoe UI" w:hAnsi="Segoe UI" w:cs="Segoe UI"/>
+          </w:rPr>
+          <w:t>PMID: 41706493</w:t>
+        </w:r>
+      </w:hyperlink>
+      <w:r>
+        <w:rPr>
+          <w:rFonts w:ascii="Segoe UI" w:hAnsi="Segoe UI" w:cs="Segoe UI"/>
+          <w:color w:val="212121"/>
+        </w:rPr>
+        <w:t>.</w:t>
       </w:r>
     </w:p>
     <w:p>
@@ -3298,19 +3706,278 @@
       </w:pPr>
       <w:r>
         <w:rPr>
+          <w:rFonts w:ascii="Segoe UI" w:hAnsi="Segoe UI" w:cs="Segoe UI"/>
+          <w:color w:val="212121"/>
+        </w:rPr>
+        <w:t>This meta-analysis synthesized data from 55 published longitudinal studies (encompassing 540,712 participants) examining the association between spirituality and harmful or hazardous alcohol and other drug use. The researchers reviewed over 20,000 studies on spirituality and health published between 2000 and 2022, identifying 55 high-quality longitudinal studies. Broad spiritual practices, including spiritual and religious community involvement, attending religious services, meditation, and prayer, reduced individuals' risk of dangerous alcohol and drug use by 13%. Among individuals attending religious services at least once per week, the risk reduction was 18%. Results were consistent across all drug categories studied (alcohol, tobacco, marijuana, and illicit drugs). The findings have implications for clinicians and communities regarding future strategies for alcohol and other drug use prevention and recovery.</w:t>
+      </w:r>
+    </w:p>
+    <w:p>
+      <w:pPr>
+        <w:shd w:val="clear" w:color="auto" w:fill="FFFFFF"/>
+        <w:spacing w:after="0" w:line="240" w:lineRule="auto"/>
+      </w:pPr>
+    </w:p>
+    <w:p>
+      <w:pPr>
+        <w:pStyle w:val="Heading1"/>
+        <w:shd w:val="clear" w:color="auto" w:fill="FFFFFF"/>
+      </w:pPr>
+      <w:r>
+        <w:rPr>
+          <w:rFonts w:ascii="Merriweather" w:hAnsi="Merriweather"/>
+          <w:color w:val="212121"/>
+        </w:rPr>
+        <w:t>Efficacy and Safety of Lithium for Behavioral and Cognitive Symptoms in Alzheimer's Disease Dementia: A Systematic Review With Frequentist and Bayesian Meta-Analysis</w:t>
+      </w:r>
+    </w:p>
+    <w:p>
+      <w:pPr>
+        <w:shd w:val="clear" w:color="auto" w:fill="FFFFFF"/>
+        <w:spacing w:after="0" w:line="240" w:lineRule="auto"/>
+      </w:pPr>
+      <w:r>
+        <w:rPr>
+          <w:rFonts w:ascii="Segoe UI" w:hAnsi="Segoe UI" w:cs="Segoe UI"/>
+          <w:color w:val="212121"/>
+        </w:rPr>
+        <w:lastRenderedPageBreak/>
+        <w:t xml:space="preserve">Pereira da Silva AM, de Deus O, Ribeiro FV, </w:t>
+      </w:r>
+      <w:proofErr w:type="spellStart"/>
+      <w:r>
+        <w:rPr>
+          <w:rFonts w:ascii="Segoe UI" w:hAnsi="Segoe UI" w:cs="Segoe UI"/>
+          <w:color w:val="212121"/>
+        </w:rPr>
+        <w:t>Tudella</w:t>
+      </w:r>
+      <w:proofErr w:type="spellEnd"/>
+      <w:r>
+        <w:rPr>
+          <w:rFonts w:ascii="Segoe UI" w:hAnsi="Segoe UI" w:cs="Segoe UI"/>
+          <w:color w:val="212121"/>
+        </w:rPr>
+        <w:t xml:space="preserve"> GC, Cabeça LS, Silva LL, et al. Efficacy and Safety of Lithium for Behavioral and Cognitive Symptoms in Alzheimer's Disease Dementia: A Systematic Review </w:t>
+      </w:r>
+      <w:proofErr w:type="gramStart"/>
+      <w:r>
+        <w:rPr>
+          <w:rFonts w:ascii="Segoe UI" w:hAnsi="Segoe UI" w:cs="Segoe UI"/>
+          <w:color w:val="212121"/>
+        </w:rPr>
+        <w:t>With</w:t>
+      </w:r>
+      <w:proofErr w:type="gramEnd"/>
+      <w:r>
+        <w:rPr>
+          <w:rFonts w:ascii="Segoe UI" w:hAnsi="Segoe UI" w:cs="Segoe UI"/>
+          <w:color w:val="212121"/>
+        </w:rPr>
+        <w:t xml:space="preserve"> Frequentist and Bayesian Meta-Analysis. Am J </w:t>
+      </w:r>
+      <w:proofErr w:type="spellStart"/>
+      <w:r>
+        <w:rPr>
+          <w:rFonts w:ascii="Segoe UI" w:hAnsi="Segoe UI" w:cs="Segoe UI"/>
+          <w:color w:val="212121"/>
+        </w:rPr>
+        <w:t>Geriatr</w:t>
+      </w:r>
+      <w:proofErr w:type="spellEnd"/>
+      <w:r>
+        <w:rPr>
+          <w:rFonts w:ascii="Segoe UI" w:hAnsi="Segoe UI" w:cs="Segoe UI"/>
+          <w:color w:val="212121"/>
+        </w:rPr>
+        <w:t xml:space="preserve"> Psychiatry. 2025 Oct </w:t>
+      </w:r>
+      <w:proofErr w:type="gramStart"/>
+      <w:r>
+        <w:rPr>
+          <w:rFonts w:ascii="Segoe UI" w:hAnsi="Segoe UI" w:cs="Segoe UI"/>
+          <w:color w:val="212121"/>
+        </w:rPr>
+        <w:t>4:S</w:t>
+      </w:r>
+      <w:proofErr w:type="gramEnd"/>
+      <w:r>
+        <w:rPr>
+          <w:rFonts w:ascii="Segoe UI" w:hAnsi="Segoe UI" w:cs="Segoe UI"/>
+          <w:color w:val="212121"/>
+        </w:rPr>
+        <w:t xml:space="preserve">1064-7481(25)00496-8. </w:t>
+      </w:r>
+      <w:proofErr w:type="spellStart"/>
+      <w:r>
+        <w:rPr>
+          <w:rFonts w:ascii="Segoe UI" w:hAnsi="Segoe UI" w:cs="Segoe UI"/>
+          <w:color w:val="212121"/>
+        </w:rPr>
+        <w:t>doi</w:t>
+      </w:r>
+      <w:proofErr w:type="spellEnd"/>
+      <w:r>
+        <w:rPr>
+          <w:rFonts w:ascii="Segoe UI" w:hAnsi="Segoe UI" w:cs="Segoe UI"/>
+          <w:color w:val="212121"/>
+        </w:rPr>
+        <w:t xml:space="preserve">: 10.1016/j.jagp.2025.10.001 </w:t>
+      </w:r>
+      <w:hyperlink r:id="rId38" w:history="1">
+        <w:r>
+          <w:rPr>
+            <w:rStyle w:val="Hyperlink"/>
+            <w:rFonts w:ascii="Segoe UI" w:hAnsi="Segoe UI" w:cs="Segoe UI"/>
+          </w:rPr>
+          <w:t>PMID: 41177743</w:t>
+        </w:r>
+      </w:hyperlink>
+      <w:r>
+        <w:rPr>
+          <w:rFonts w:ascii="Segoe UI" w:hAnsi="Segoe UI" w:cs="Segoe UI"/>
+          <w:color w:val="212121"/>
+        </w:rPr>
+        <w:t>.</w:t>
+      </w:r>
+    </w:p>
+    <w:p>
+      <w:pPr>
+        <w:pStyle w:val="NormalWeb"/>
+        <w:shd w:val="clear" w:color="auto" w:fill="FFFFFF"/>
+      </w:pPr>
+      <w:r>
+        <w:rPr>
           <w:rStyle w:val="Strong"/>
           <w:rFonts w:ascii="Segoe UI" w:hAnsi="Segoe UI" w:cs="Segoe UI"/>
           <w:color w:val="212121"/>
         </w:rPr>
+        <w:t xml:space="preserve">Objective: </w:t>
+      </w:r>
+    </w:p>
+    <w:p>
+      <w:pPr>
+        <w:pStyle w:val="NormalWeb"/>
+        <w:shd w:val="clear" w:color="auto" w:fill="FFFFFF"/>
+      </w:pPr>
+      <w:r>
+        <w:rPr>
+          <w:rFonts w:ascii="Segoe UI" w:hAnsi="Segoe UI" w:cs="Segoe UI"/>
+          <w:color w:val="212121"/>
+        </w:rPr>
+        <w:t>Does lithium treatment provide cognitive, functional, neuropsychiatric, or biomarker benefits in patients with Alzheimer's disease dementia?</w:t>
+      </w:r>
+    </w:p>
+    <w:p>
+      <w:pPr>
+        <w:pStyle w:val="NormalWeb"/>
+        <w:shd w:val="clear" w:color="auto" w:fill="FFFFFF"/>
+      </w:pPr>
+      <w:r>
+        <w:rPr>
+          <w:rStyle w:val="Strong"/>
+          <w:rFonts w:ascii="Segoe UI" w:hAnsi="Segoe UI" w:cs="Segoe UI"/>
+          <w:color w:val="212121"/>
+        </w:rPr>
+        <w:t xml:space="preserve">Background: </w:t>
+      </w:r>
+    </w:p>
+    <w:p>
+      <w:pPr>
+        <w:pStyle w:val="NormalWeb"/>
+        <w:shd w:val="clear" w:color="auto" w:fill="FFFFFF"/>
+      </w:pPr>
+      <w:r>
+        <w:rPr>
+          <w:rFonts w:ascii="Segoe UI" w:hAnsi="Segoe UI" w:cs="Segoe UI"/>
+          <w:color w:val="212121"/>
+        </w:rPr>
+        <w:t>Alzheimer's disease (AD) dementia is the leading cause of cognitive decline in late life, yet treatment options remain limited.</w:t>
+      </w:r>
+    </w:p>
+    <w:p>
+      <w:pPr>
+        <w:pStyle w:val="NormalWeb"/>
+        <w:shd w:val="clear" w:color="auto" w:fill="FFFFFF"/>
+      </w:pPr>
+      <w:r>
+        <w:rPr>
+          <w:rStyle w:val="Strong"/>
+          <w:rFonts w:ascii="Segoe UI" w:hAnsi="Segoe UI" w:cs="Segoe UI"/>
+          <w:color w:val="212121"/>
+        </w:rPr>
+        <w:t xml:space="preserve">Methods: </w:t>
+      </w:r>
+    </w:p>
+    <w:p>
+      <w:pPr>
+        <w:pStyle w:val="NormalWeb"/>
+        <w:shd w:val="clear" w:color="auto" w:fill="FFFFFF"/>
+      </w:pPr>
+      <w:r>
+        <w:rPr>
+          <w:rFonts w:ascii="Segoe UI" w:hAnsi="Segoe UI" w:cs="Segoe UI"/>
+          <w:color w:val="212121"/>
+        </w:rPr>
+        <w:t xml:space="preserve">This systematic review and meta-analysis </w:t>
+      </w:r>
+      <w:proofErr w:type="gramStart"/>
+      <w:r>
+        <w:rPr>
+          <w:rFonts w:ascii="Segoe UI" w:hAnsi="Segoe UI" w:cs="Segoe UI"/>
+          <w:color w:val="212121"/>
+        </w:rPr>
+        <w:t>was</w:t>
+      </w:r>
+      <w:proofErr w:type="gramEnd"/>
+      <w:r>
+        <w:rPr>
+          <w:rFonts w:ascii="Segoe UI" w:hAnsi="Segoe UI" w:cs="Segoe UI"/>
+          <w:color w:val="212121"/>
+        </w:rPr>
+        <w:t xml:space="preserve"> prospectively registered in PROSPERO and conducted following PRISMA guidelines. We searched PubMed, Embase, and Cochrane Library through April 2025 for randomized controlled trials (RCTs) comparing lithium with placebo or standard therapy in patients with AD dementia or amnestic mild cognitive impairment. Outcomes included cognition (MMSE, ADAS-Cog, memory tasks), function (CDR-SB, conversion to AD), neuropsychiatric symptoms (NPI), CSF biomarkers, and safety (adverse events [AEs], serious AEs [SAEs]). Random-effects meta-analyses were complemented by Bayesian methods and trial sequential analyses.</w:t>
+      </w:r>
+    </w:p>
+    <w:p>
+      <w:pPr>
+        <w:pStyle w:val="NormalWeb"/>
+        <w:shd w:val="clear" w:color="auto" w:fill="FFFFFF"/>
+      </w:pPr>
+      <w:r>
+        <w:rPr>
+          <w:rStyle w:val="Strong"/>
+          <w:rFonts w:ascii="Segoe UI" w:hAnsi="Segoe UI" w:cs="Segoe UI"/>
+          <w:color w:val="212121"/>
+        </w:rPr>
+        <w:t xml:space="preserve">Results: </w:t>
+      </w:r>
+    </w:p>
+    <w:p>
+      <w:pPr>
+        <w:pStyle w:val="NormalWeb"/>
+        <w:shd w:val="clear" w:color="auto" w:fill="FFFFFF"/>
+      </w:pPr>
+      <w:r>
+        <w:rPr>
+          <w:rFonts w:ascii="Segoe UI" w:hAnsi="Segoe UI" w:cs="Segoe UI"/>
+          <w:color w:val="212121"/>
+        </w:rPr>
+        <w:t>Six RCTs involving 394 participants (196 lithium, 198 placebo) met inclusion criteria. Lithium did not significantly improve global cognition (MMSE: MD -1.61, 95% CI -4.11 to 0.88; ADAS-Cog: MD -1.82, -3.05 to -0.60; both with high heterogeneity).</w:t>
+      </w:r>
+    </w:p>
+    <w:p>
+      <w:pPr>
+        <w:pStyle w:val="NormalWeb"/>
+        <w:shd w:val="clear" w:color="auto" w:fill="FFFFFF"/>
+      </w:pPr>
+      <w:r>
+        <w:rPr>
+          <w:rStyle w:val="Strong"/>
+          <w:rFonts w:ascii="Segoe UI" w:hAnsi="Segoe UI" w:cs="Segoe UI"/>
+          <w:color w:val="212121"/>
+        </w:rPr>
         <w:t xml:space="preserve">Conclusions: </w:t>
       </w:r>
-      <w:r>
-        <w:rPr>
-          <w:rFonts w:ascii="Segoe UI" w:hAnsi="Segoe UI" w:cs="Segoe UI"/>
-          <w:color w:val="212121"/>
-        </w:rPr>
-        <w:t>and relevance: Adjunctive dronabinol treatment was safe and effective for treating agitation in AD.</w:t>
-      </w:r>
     </w:p>
     <w:p>
       <w:pPr>
@@ -3319,18 +3986,10 @@
       </w:pPr>
       <w:r>
         <w:rPr>
-          <w:rStyle w:val="Strong"/>
-          <w:rFonts w:ascii="Segoe UI" w:hAnsi="Segoe UI" w:cs="Segoe UI"/>
-          <w:color w:val="212121"/>
-        </w:rPr>
-        <w:t xml:space="preserve">Clinical trials registration: </w:t>
-      </w:r>
-      <w:r>
-        <w:rPr>
-          <w:rFonts w:ascii="Segoe UI" w:hAnsi="Segoe UI" w:cs="Segoe UI"/>
-          <w:color w:val="212121"/>
-        </w:rPr>
-        <w:t>NCT02792257.</w:t>
+          <w:rFonts w:ascii="Segoe UI" w:hAnsi="Segoe UI" w:cs="Segoe UI"/>
+          <w:color w:val="212121"/>
+        </w:rPr>
+        <w:t>Lithium did not demonstrate consistent benefits on cognition, function, neuropsychiatric symptoms, or CSF biomarkers. Current evidence suggests lithium is generally well tolerated, but its therapeutic role in Alzheimer's disease dementia remains unproven. Larger, well-designed RCTs are required before it can be considered for clinical application.</w:t>
       </w:r>
     </w:p>
     <w:p>
@@ -3349,68 +4008,21 @@
           <w:rFonts w:ascii="Merriweather" w:hAnsi="Merriweather"/>
           <w:color w:val="212121"/>
         </w:rPr>
-        <w:t>Antibiomania: A Systematic Review of Clarithromycin-Associated Manic Episodes</w:t>
-      </w:r>
-    </w:p>
-    <w:p>
-      <w:pPr>
-        <w:shd w:val="clear" w:color="auto" w:fill="FFFFFF"/>
-        <w:spacing w:after="0" w:line="240" w:lineRule="auto"/>
-      </w:pPr>
-      <w:r>
-        <w:rPr>
-          <w:rFonts w:ascii="Segoe UI" w:hAnsi="Segoe UI" w:cs="Segoe UI"/>
-          <w:color w:val="212121"/>
-        </w:rPr>
-        <w:t xml:space="preserve">Marković T, Todorović A, Stojković M, Popović S, </w:t>
-      </w:r>
-      <w:proofErr w:type="spellStart"/>
-      <w:r>
-        <w:rPr>
-          <w:rFonts w:ascii="Segoe UI" w:hAnsi="Segoe UI" w:cs="Segoe UI"/>
-          <w:color w:val="212121"/>
-        </w:rPr>
-        <w:t>Baskić</w:t>
-      </w:r>
-      <w:proofErr w:type="spellEnd"/>
-      <w:r>
-        <w:rPr>
-          <w:rFonts w:ascii="Segoe UI" w:hAnsi="Segoe UI" w:cs="Segoe UI"/>
-          <w:color w:val="212121"/>
-        </w:rPr>
-        <w:t xml:space="preserve"> D, Matić S. </w:t>
-      </w:r>
-      <w:proofErr w:type="spellStart"/>
-      <w:r>
-        <w:rPr>
-          <w:rFonts w:ascii="Segoe UI" w:hAnsi="Segoe UI" w:cs="Segoe UI"/>
-          <w:color w:val="212121"/>
-        </w:rPr>
-        <w:t>Antibiomania</w:t>
-      </w:r>
-      <w:proofErr w:type="spellEnd"/>
-      <w:r>
-        <w:rPr>
-          <w:rFonts w:ascii="Segoe UI" w:hAnsi="Segoe UI" w:cs="Segoe UI"/>
-          <w:color w:val="212121"/>
-        </w:rPr>
-        <w:t xml:space="preserve">: A Systematic Review of Clarithromycin-Associated Manic Episodes. J Clin </w:t>
-      </w:r>
-      <w:proofErr w:type="spellStart"/>
-      <w:r>
-        <w:rPr>
-          <w:rFonts w:ascii="Segoe UI" w:hAnsi="Segoe UI" w:cs="Segoe UI"/>
-          <w:color w:val="212121"/>
-        </w:rPr>
-        <w:t>Psychopharmacol</w:t>
-      </w:r>
-      <w:proofErr w:type="spellEnd"/>
-      <w:r>
-        <w:rPr>
-          <w:rFonts w:ascii="Segoe UI" w:hAnsi="Segoe UI" w:cs="Segoe UI"/>
-          <w:color w:val="212121"/>
-        </w:rPr>
-        <w:t xml:space="preserve">. 2026;46(1):82-92. </w:t>
+        <w:lastRenderedPageBreak/>
+        <w:t>Recognizing Grief in Neurodivergent Minds</w:t>
+      </w:r>
+    </w:p>
+    <w:p>
+      <w:pPr>
+        <w:shd w:val="clear" w:color="auto" w:fill="FFFFFF"/>
+        <w:spacing w:after="0" w:line="240" w:lineRule="auto"/>
+      </w:pPr>
+      <w:r>
+        <w:rPr>
+          <w:rFonts w:ascii="Segoe UI" w:hAnsi="Segoe UI" w:cs="Segoe UI"/>
+          <w:color w:val="212121"/>
+        </w:rPr>
+        <w:t xml:space="preserve">Munir KM. Recognizing Grief in Neurodivergent Minds. JAMA Psychiatry. 2026;83(2):116-117. </w:t>
       </w:r>
       <w:proofErr w:type="spellStart"/>
       <w:r>
@@ -3426,15 +4038,15 @@
           <w:rFonts w:ascii="Segoe UI" w:hAnsi="Segoe UI" w:cs="Segoe UI"/>
           <w:color w:val="212121"/>
         </w:rPr>
-        <w:t xml:space="preserve">: 10.1097/JCP.0000000000002089 </w:t>
-      </w:r>
-      <w:hyperlink r:id="rId36" w:history="1">
+        <w:t xml:space="preserve">: 10.1001/jamapsychiatry.2025.4225 </w:t>
+      </w:r>
+      <w:hyperlink r:id="rId39" w:history="1">
         <w:r>
           <w:rPr>
             <w:rStyle w:val="Hyperlink"/>
             <w:rFonts w:ascii="Segoe UI" w:hAnsi="Segoe UI" w:cs="Segoe UI"/>
           </w:rPr>
-          <w:t>DOI link</w:t>
+          <w:t>PMID: 41432942</w:t>
         </w:r>
       </w:hyperlink>
       <w:r>
@@ -3452,51 +4064,10 @@
       </w:pPr>
       <w:r>
         <w:rPr>
-          <w:rStyle w:val="Strong"/>
-          <w:rFonts w:ascii="Segoe UI" w:hAnsi="Segoe UI" w:cs="Segoe UI"/>
-          <w:color w:val="212121"/>
-        </w:rPr>
-        <w:t xml:space="preserve">Purpose: </w:t>
-      </w:r>
-      <w:proofErr w:type="spellStart"/>
-      <w:r>
-        <w:rPr>
-          <w:rFonts w:ascii="Segoe UI" w:hAnsi="Segoe UI" w:cs="Segoe UI"/>
-          <w:color w:val="212121"/>
-        </w:rPr>
-        <w:t>Antibiomania</w:t>
-      </w:r>
-      <w:proofErr w:type="spellEnd"/>
-      <w:r>
-        <w:rPr>
-          <w:rFonts w:ascii="Segoe UI" w:hAnsi="Segoe UI" w:cs="Segoe UI"/>
-          <w:color w:val="212121"/>
-        </w:rPr>
-        <w:t xml:space="preserve">, a rare adverse reaction, refers to antibiotic-induced mania, with clarithromycin most frequently implicated. Symptoms include mood elevation, hyperactivity, and hallucinations, typically resolving after discontinuation of the drug. This review examines reported cases to better characterize clinical patterns and guide clinical recognition and management. Methods: A systematic review was conducted following PRISMA guidelines and registered with PROSPERO. Literature searches were performed in PubMed/MEDLINE, Web of Science, Scopus, and EMBASE using keywords related to clarithromycin, mania, and psychosis. Studies were included regardless of language or publication date. Data extraction focused on demographic details, clinical presentation, treatment, and causality assessment. The quality of case reports was assessed using standardized criteria. FAERS and </w:t>
-      </w:r>
-      <w:proofErr w:type="spellStart"/>
-      <w:r>
-        <w:rPr>
-          <w:rFonts w:ascii="Segoe UI" w:hAnsi="Segoe UI" w:cs="Segoe UI"/>
-          <w:color w:val="212121"/>
-        </w:rPr>
-        <w:t>EudraVigilance</w:t>
-      </w:r>
-      <w:proofErr w:type="spellEnd"/>
-      <w:r>
-        <w:rPr>
-          <w:rFonts w:ascii="Segoe UI" w:hAnsi="Segoe UI" w:cs="Segoe UI"/>
-          <w:color w:val="212121"/>
-        </w:rPr>
-        <w:t xml:space="preserve"> databases were queried to identify spontaneously reported psychiatric adverse events associated with clarithromycin. Results: A total of 32 studies involving 34 patients were included. Most patients were under 65 years old, with a nearly equal distribution of genders. Manic episodes often included psychotic symptoms and emerged ~4 days after the initiation of clarithromycin, lasting about 3 days. The most common dosage was 500mg taken twice daily. Rechallenge in 5 cases consistently reproduced the symptoms. Causality assessment using the Naranjo and WHO-UMC score suggested a probable association in most cases. All patients fully recovered after discontinuation. Conclusions: Clarithromycin may trigger secondary mania, emphasizing the need for clinician awareness of this rare psychiatric side effect. Timely recognition and appropriate </w:t>
-      </w:r>
-      <w:r>
-        <w:rPr>
-          <w:rFonts w:ascii="Segoe UI" w:hAnsi="Segoe UI" w:cs="Segoe UI"/>
-          <w:color w:val="212121"/>
-        </w:rPr>
-        <w:lastRenderedPageBreak/>
-        <w:t>management can enhance patient outcomes and prevent unnecessary psychiatric interventions.</w:t>
+          <w:rFonts w:ascii="Segoe UI" w:hAnsi="Segoe UI" w:cs="Segoe UI"/>
+          <w:color w:val="212121"/>
+        </w:rPr>
+        <w:t>This Viewpoint discusses the trajectories of grief in neurodivergent individuals and how clinicians must assess changes from baseline rather than applying criteria without context and distinguish between grief-related functional decline and loss of adaptive support after a caregiver's death.</w:t>
       </w:r>
     </w:p>
     <w:p>
@@ -3515,488 +4086,6 @@
           <w:rFonts w:ascii="Merriweather" w:hAnsi="Merriweather"/>
           <w:color w:val="212121"/>
         </w:rPr>
-        <w:t>Spirituality and Harmful or Hazardous Alcohol and Other Drug Use: A Meta-Analysis of Longitudinal Studies</w:t>
-      </w:r>
-    </w:p>
-    <w:p>
-      <w:pPr>
-        <w:shd w:val="clear" w:color="auto" w:fill="FFFFFF"/>
-        <w:spacing w:after="0" w:line="240" w:lineRule="auto"/>
-      </w:pPr>
-      <w:r>
-        <w:rPr>
-          <w:rFonts w:ascii="Segoe UI" w:hAnsi="Segoe UI" w:cs="Segoe UI"/>
-          <w:color w:val="212121"/>
-        </w:rPr>
-        <w:t xml:space="preserve">Koh HK, Frederick DE, Balboni TA, O'Reilly SM, Kelly JF, Humphreys K, et al. Spirituality and Harmful or Hazardous Alcohol and Other Drug Use: A Meta-Analysis of Longitudinal Studies. JAMA Psychiatry. 2026 Feb </w:t>
-      </w:r>
-      <w:proofErr w:type="gramStart"/>
-      <w:r>
-        <w:rPr>
-          <w:rFonts w:ascii="Segoe UI" w:hAnsi="Segoe UI" w:cs="Segoe UI"/>
-          <w:color w:val="212121"/>
-        </w:rPr>
-        <w:t>18:e</w:t>
-      </w:r>
-      <w:proofErr w:type="gramEnd"/>
-      <w:r>
-        <w:rPr>
-          <w:rFonts w:ascii="Segoe UI" w:hAnsi="Segoe UI" w:cs="Segoe UI"/>
-          <w:color w:val="212121"/>
-        </w:rPr>
-        <w:t xml:space="preserve">254816. </w:t>
-      </w:r>
-      <w:proofErr w:type="spellStart"/>
-      <w:r>
-        <w:rPr>
-          <w:rFonts w:ascii="Segoe UI" w:hAnsi="Segoe UI" w:cs="Segoe UI"/>
-          <w:color w:val="212121"/>
-        </w:rPr>
-        <w:t>doi</w:t>
-      </w:r>
-      <w:proofErr w:type="spellEnd"/>
-      <w:r>
-        <w:rPr>
-          <w:rFonts w:ascii="Segoe UI" w:hAnsi="Segoe UI" w:cs="Segoe UI"/>
-          <w:color w:val="212121"/>
-        </w:rPr>
-        <w:t xml:space="preserve">: 10.1001/jamapsychiatry.2025.4816. </w:t>
-      </w:r>
-      <w:proofErr w:type="spellStart"/>
-      <w:r>
-        <w:rPr>
-          <w:rFonts w:ascii="Segoe UI" w:hAnsi="Segoe UI" w:cs="Segoe UI"/>
-          <w:color w:val="212121"/>
-        </w:rPr>
-        <w:t>Epub</w:t>
-      </w:r>
-      <w:proofErr w:type="spellEnd"/>
-      <w:r>
-        <w:rPr>
-          <w:rFonts w:ascii="Segoe UI" w:hAnsi="Segoe UI" w:cs="Segoe UI"/>
-          <w:color w:val="212121"/>
-        </w:rPr>
-        <w:t xml:space="preserve"> ahead of print</w:t>
-      </w:r>
-      <w:proofErr w:type="gramStart"/>
-      <w:r>
-        <w:rPr>
-          <w:rFonts w:ascii="Segoe UI" w:hAnsi="Segoe UI" w:cs="Segoe UI"/>
-          <w:color w:val="212121"/>
-        </w:rPr>
-        <w:t>. ;</w:t>
-      </w:r>
-      <w:proofErr w:type="gramEnd"/>
-      <w:r>
-        <w:rPr>
-          <w:rFonts w:ascii="Segoe UI" w:hAnsi="Segoe UI" w:cs="Segoe UI"/>
-          <w:color w:val="212121"/>
-        </w:rPr>
-        <w:t xml:space="preserve"> PMCID: PMC12917744 </w:t>
-      </w:r>
-      <w:hyperlink r:id="rId37" w:history="1">
-        <w:r>
-          <w:rPr>
-            <w:rStyle w:val="Hyperlink"/>
-            <w:rFonts w:ascii="Segoe UI" w:hAnsi="Segoe UI" w:cs="Segoe UI"/>
-          </w:rPr>
-          <w:t>PMID: 41706493</w:t>
-        </w:r>
-      </w:hyperlink>
-      <w:r>
-        <w:rPr>
-          <w:rFonts w:ascii="Segoe UI" w:hAnsi="Segoe UI" w:cs="Segoe UI"/>
-          <w:color w:val="212121"/>
-        </w:rPr>
-        <w:t>.</w:t>
-      </w:r>
-    </w:p>
-    <w:p>
-      <w:pPr>
-        <w:pStyle w:val="NormalWeb"/>
-        <w:shd w:val="clear" w:color="auto" w:fill="FFFFFF"/>
-      </w:pPr>
-      <w:r>
-        <w:rPr>
-          <w:rFonts w:ascii="Segoe UI" w:hAnsi="Segoe UI" w:cs="Segoe UI"/>
-          <w:color w:val="212121"/>
-        </w:rPr>
-        <w:t>This meta-analysis synthesized data from 55 published longitudinal studies (encompassing 540,712 participants) examining the association between spirituality and harmful or hazardous alcohol and other drug use. The researchers reviewed over 20,000 studies on spirituality and health published between 2000 and 2022, identifying 55 high-quality longitudinal studies. Broad spiritual practices, including spiritual and religious community involvement, attending religious services, meditation, and prayer, reduced individuals' risk of dangerous alcohol and drug use by 13%. Among individuals attending religious services at least once per week, the risk reduction was 18%. Results were consistent across all drug categories studied (alcohol, tobacco, marijuana, and illicit drugs). The findings have implications for clinicians and communities regarding future strategies for alcohol and other drug use prevention and recovery.</w:t>
-      </w:r>
-    </w:p>
-    <w:p>
-      <w:pPr>
-        <w:shd w:val="clear" w:color="auto" w:fill="FFFFFF"/>
-        <w:spacing w:after="0" w:line="240" w:lineRule="auto"/>
-      </w:pPr>
-    </w:p>
-    <w:p>
-      <w:pPr>
-        <w:pStyle w:val="Heading1"/>
-        <w:shd w:val="clear" w:color="auto" w:fill="FFFFFF"/>
-      </w:pPr>
-      <w:r>
-        <w:rPr>
-          <w:rFonts w:ascii="Merriweather" w:hAnsi="Merriweather"/>
-          <w:color w:val="212121"/>
-        </w:rPr>
-        <w:t>Efficacy and Safety of Lithium for Behavioral and Cognitive Symptoms in Alzheimer's Disease Dementia: A Systematic Review With Frequentist and Bayesian Meta-Analysis</w:t>
-      </w:r>
-    </w:p>
-    <w:p>
-      <w:pPr>
-        <w:shd w:val="clear" w:color="auto" w:fill="FFFFFF"/>
-        <w:spacing w:after="0" w:line="240" w:lineRule="auto"/>
-      </w:pPr>
-      <w:r>
-        <w:rPr>
-          <w:rFonts w:ascii="Segoe UI" w:hAnsi="Segoe UI" w:cs="Segoe UI"/>
-          <w:color w:val="212121"/>
-        </w:rPr>
-        <w:t xml:space="preserve">Pereira da Silva AM, de Deus O, Ribeiro FV, </w:t>
-      </w:r>
-      <w:proofErr w:type="spellStart"/>
-      <w:r>
-        <w:rPr>
-          <w:rFonts w:ascii="Segoe UI" w:hAnsi="Segoe UI" w:cs="Segoe UI"/>
-          <w:color w:val="212121"/>
-        </w:rPr>
-        <w:t>Tudella</w:t>
-      </w:r>
-      <w:proofErr w:type="spellEnd"/>
-      <w:r>
-        <w:rPr>
-          <w:rFonts w:ascii="Segoe UI" w:hAnsi="Segoe UI" w:cs="Segoe UI"/>
-          <w:color w:val="212121"/>
-        </w:rPr>
-        <w:t xml:space="preserve"> GC, Cabeça LS, Silva LL, et al. Efficacy and Safety of Lithium for Behavioral and Cognitive Symptoms in Alzheimer's Disease Dementia: A Systematic Review </w:t>
-      </w:r>
-      <w:proofErr w:type="gramStart"/>
-      <w:r>
-        <w:rPr>
-          <w:rFonts w:ascii="Segoe UI" w:hAnsi="Segoe UI" w:cs="Segoe UI"/>
-          <w:color w:val="212121"/>
-        </w:rPr>
-        <w:t>With</w:t>
-      </w:r>
-      <w:proofErr w:type="gramEnd"/>
-      <w:r>
-        <w:rPr>
-          <w:rFonts w:ascii="Segoe UI" w:hAnsi="Segoe UI" w:cs="Segoe UI"/>
-          <w:color w:val="212121"/>
-        </w:rPr>
-        <w:t xml:space="preserve"> Frequentist and Bayesian Meta-Analysis. Am J </w:t>
-      </w:r>
-      <w:proofErr w:type="spellStart"/>
-      <w:r>
-        <w:rPr>
-          <w:rFonts w:ascii="Segoe UI" w:hAnsi="Segoe UI" w:cs="Segoe UI"/>
-          <w:color w:val="212121"/>
-        </w:rPr>
-        <w:t>Geriatr</w:t>
-      </w:r>
-      <w:proofErr w:type="spellEnd"/>
-      <w:r>
-        <w:rPr>
-          <w:rFonts w:ascii="Segoe UI" w:hAnsi="Segoe UI" w:cs="Segoe UI"/>
-          <w:color w:val="212121"/>
-        </w:rPr>
-        <w:t xml:space="preserve"> Psychiatry. 2025 Oct </w:t>
-      </w:r>
-      <w:proofErr w:type="gramStart"/>
-      <w:r>
-        <w:rPr>
-          <w:rFonts w:ascii="Segoe UI" w:hAnsi="Segoe UI" w:cs="Segoe UI"/>
-          <w:color w:val="212121"/>
-        </w:rPr>
-        <w:t>4:S</w:t>
-      </w:r>
-      <w:proofErr w:type="gramEnd"/>
-      <w:r>
-        <w:rPr>
-          <w:rFonts w:ascii="Segoe UI" w:hAnsi="Segoe UI" w:cs="Segoe UI"/>
-          <w:color w:val="212121"/>
-        </w:rPr>
-        <w:t xml:space="preserve">1064-7481(25)00496-8. </w:t>
-      </w:r>
-      <w:proofErr w:type="spellStart"/>
-      <w:r>
-        <w:rPr>
-          <w:rFonts w:ascii="Segoe UI" w:hAnsi="Segoe UI" w:cs="Segoe UI"/>
-          <w:color w:val="212121"/>
-        </w:rPr>
-        <w:t>doi</w:t>
-      </w:r>
-      <w:proofErr w:type="spellEnd"/>
-      <w:r>
-        <w:rPr>
-          <w:rFonts w:ascii="Segoe UI" w:hAnsi="Segoe UI" w:cs="Segoe UI"/>
-          <w:color w:val="212121"/>
-        </w:rPr>
-        <w:t xml:space="preserve">: 10.1016/j.jagp.2025.10.001 </w:t>
-      </w:r>
-      <w:hyperlink r:id="rId38" w:history="1">
-        <w:r>
-          <w:rPr>
-            <w:rStyle w:val="Hyperlink"/>
-            <w:rFonts w:ascii="Segoe UI" w:hAnsi="Segoe UI" w:cs="Segoe UI"/>
-          </w:rPr>
-          <w:t>PMID: 41177743</w:t>
-        </w:r>
-      </w:hyperlink>
-      <w:r>
-        <w:rPr>
-          <w:rFonts w:ascii="Segoe UI" w:hAnsi="Segoe UI" w:cs="Segoe UI"/>
-          <w:color w:val="212121"/>
-        </w:rPr>
-        <w:t>.</w:t>
-      </w:r>
-    </w:p>
-    <w:p>
-      <w:pPr>
-        <w:pStyle w:val="NormalWeb"/>
-        <w:shd w:val="clear" w:color="auto" w:fill="FFFFFF"/>
-      </w:pPr>
-      <w:r>
-        <w:rPr>
-          <w:rStyle w:val="Strong"/>
-          <w:rFonts w:ascii="Segoe UI" w:hAnsi="Segoe UI" w:cs="Segoe UI"/>
-          <w:color w:val="212121"/>
-        </w:rPr>
-        <w:t xml:space="preserve">Objective: </w:t>
-      </w:r>
-    </w:p>
-    <w:p>
-      <w:pPr>
-        <w:pStyle w:val="NormalWeb"/>
-        <w:shd w:val="clear" w:color="auto" w:fill="FFFFFF"/>
-      </w:pPr>
-      <w:r>
-        <w:rPr>
-          <w:rFonts w:ascii="Segoe UI" w:hAnsi="Segoe UI" w:cs="Segoe UI"/>
-          <w:color w:val="212121"/>
-        </w:rPr>
-        <w:t>Does lithium treatment provide cognitive, functional, neuropsychiatric, or biomarker benefits in patients with Alzheimer's disease dementia?</w:t>
-      </w:r>
-    </w:p>
-    <w:p>
-      <w:pPr>
-        <w:pStyle w:val="NormalWeb"/>
-        <w:shd w:val="clear" w:color="auto" w:fill="FFFFFF"/>
-      </w:pPr>
-      <w:r>
-        <w:rPr>
-          <w:rStyle w:val="Strong"/>
-          <w:rFonts w:ascii="Segoe UI" w:hAnsi="Segoe UI" w:cs="Segoe UI"/>
-          <w:color w:val="212121"/>
-        </w:rPr>
-        <w:t xml:space="preserve">Background: </w:t>
-      </w:r>
-    </w:p>
-    <w:p>
-      <w:pPr>
-        <w:pStyle w:val="NormalWeb"/>
-        <w:shd w:val="clear" w:color="auto" w:fill="FFFFFF"/>
-      </w:pPr>
-      <w:r>
-        <w:rPr>
-          <w:rFonts w:ascii="Segoe UI" w:hAnsi="Segoe UI" w:cs="Segoe UI"/>
-          <w:color w:val="212121"/>
-        </w:rPr>
-        <w:t>Alzheimer's disease (AD) dementia is the leading cause of cognitive decline in late life, yet treatment options remain limited.</w:t>
-      </w:r>
-    </w:p>
-    <w:p>
-      <w:pPr>
-        <w:pStyle w:val="NormalWeb"/>
-        <w:shd w:val="clear" w:color="auto" w:fill="FFFFFF"/>
-      </w:pPr>
-      <w:r>
-        <w:rPr>
-          <w:rStyle w:val="Strong"/>
-          <w:rFonts w:ascii="Segoe UI" w:hAnsi="Segoe UI" w:cs="Segoe UI"/>
-          <w:color w:val="212121"/>
-        </w:rPr>
-        <w:lastRenderedPageBreak/>
-        <w:t xml:space="preserve">Methods: </w:t>
-      </w:r>
-    </w:p>
-    <w:p>
-      <w:pPr>
-        <w:pStyle w:val="NormalWeb"/>
-        <w:shd w:val="clear" w:color="auto" w:fill="FFFFFF"/>
-      </w:pPr>
-      <w:r>
-        <w:rPr>
-          <w:rFonts w:ascii="Segoe UI" w:hAnsi="Segoe UI" w:cs="Segoe UI"/>
-          <w:color w:val="212121"/>
-        </w:rPr>
-        <w:t xml:space="preserve">This systematic review and meta-analysis </w:t>
-      </w:r>
-      <w:proofErr w:type="gramStart"/>
-      <w:r>
-        <w:rPr>
-          <w:rFonts w:ascii="Segoe UI" w:hAnsi="Segoe UI" w:cs="Segoe UI"/>
-          <w:color w:val="212121"/>
-        </w:rPr>
-        <w:t>was</w:t>
-      </w:r>
-      <w:proofErr w:type="gramEnd"/>
-      <w:r>
-        <w:rPr>
-          <w:rFonts w:ascii="Segoe UI" w:hAnsi="Segoe UI" w:cs="Segoe UI"/>
-          <w:color w:val="212121"/>
-        </w:rPr>
-        <w:t xml:space="preserve"> prospectively registered in PROSPERO and conducted following PRISMA guidelines. We searched PubMed, Embase, and Cochrane Library through April 2025 for randomized controlled trials (RCTs) comparing lithium with placebo or standard therapy in patients with AD dementia or amnestic mild cognitive impairment. Outcomes included cognition (MMSE, ADAS-Cog, memory tasks), function (CDR-SB, conversion to AD), neuropsychiatric symptoms (NPI), CSF biomarkers, and safety (adverse events [AEs], serious AEs [SAEs]). Random-effects meta-analyses were complemented by Bayesian methods and trial sequential analyses.</w:t>
-      </w:r>
-    </w:p>
-    <w:p>
-      <w:pPr>
-        <w:pStyle w:val="NormalWeb"/>
-        <w:shd w:val="clear" w:color="auto" w:fill="FFFFFF"/>
-      </w:pPr>
-      <w:r>
-        <w:rPr>
-          <w:rStyle w:val="Strong"/>
-          <w:rFonts w:ascii="Segoe UI" w:hAnsi="Segoe UI" w:cs="Segoe UI"/>
-          <w:color w:val="212121"/>
-        </w:rPr>
-        <w:t xml:space="preserve">Results: </w:t>
-      </w:r>
-    </w:p>
-    <w:p>
-      <w:pPr>
-        <w:pStyle w:val="NormalWeb"/>
-        <w:shd w:val="clear" w:color="auto" w:fill="FFFFFF"/>
-      </w:pPr>
-      <w:r>
-        <w:rPr>
-          <w:rFonts w:ascii="Segoe UI" w:hAnsi="Segoe UI" w:cs="Segoe UI"/>
-          <w:color w:val="212121"/>
-        </w:rPr>
-        <w:t>Six RCTs involving 394 participants (196 lithium, 198 placebo) met inclusion criteria. Lithium did not significantly improve global cognition (MMSE: MD -1.61, 95% CI -4.11 to 0.88; ADAS-Cog: MD -1.82, -3.05 to -0.60; both with high heterogeneity).</w:t>
-      </w:r>
-    </w:p>
-    <w:p>
-      <w:pPr>
-        <w:pStyle w:val="NormalWeb"/>
-        <w:shd w:val="clear" w:color="auto" w:fill="FFFFFF"/>
-      </w:pPr>
-      <w:r>
-        <w:rPr>
-          <w:rStyle w:val="Strong"/>
-          <w:rFonts w:ascii="Segoe UI" w:hAnsi="Segoe UI" w:cs="Segoe UI"/>
-          <w:color w:val="212121"/>
-        </w:rPr>
-        <w:t xml:space="preserve">Conclusions: </w:t>
-      </w:r>
-    </w:p>
-    <w:p>
-      <w:pPr>
-        <w:pStyle w:val="NormalWeb"/>
-        <w:shd w:val="clear" w:color="auto" w:fill="FFFFFF"/>
-      </w:pPr>
-      <w:r>
-        <w:rPr>
-          <w:rFonts w:ascii="Segoe UI" w:hAnsi="Segoe UI" w:cs="Segoe UI"/>
-          <w:color w:val="212121"/>
-        </w:rPr>
-        <w:t>Lithium did not demonstrate consistent benefits on cognition, function, neuropsychiatric symptoms, or CSF biomarkers. Current evidence suggests lithium is generally well tolerated, but its therapeutic role in Alzheimer's disease dementia remains unproven. Larger, well-designed RCTs are required before it can be considered for clinical application.</w:t>
-      </w:r>
-    </w:p>
-    <w:p>
-      <w:pPr>
-        <w:shd w:val="clear" w:color="auto" w:fill="FFFFFF"/>
-        <w:spacing w:after="0" w:line="240" w:lineRule="auto"/>
-      </w:pPr>
-    </w:p>
-    <w:p>
-      <w:pPr>
-        <w:pStyle w:val="Heading1"/>
-        <w:shd w:val="clear" w:color="auto" w:fill="FFFFFF"/>
-      </w:pPr>
-      <w:r>
-        <w:rPr>
-          <w:rFonts w:ascii="Merriweather" w:hAnsi="Merriweather"/>
-          <w:color w:val="212121"/>
-        </w:rPr>
-        <w:t>Recognizing Grief in Neurodivergent Minds</w:t>
-      </w:r>
-    </w:p>
-    <w:p>
-      <w:pPr>
-        <w:shd w:val="clear" w:color="auto" w:fill="FFFFFF"/>
-        <w:spacing w:after="0" w:line="240" w:lineRule="auto"/>
-      </w:pPr>
-      <w:r>
-        <w:rPr>
-          <w:rFonts w:ascii="Segoe UI" w:hAnsi="Segoe UI" w:cs="Segoe UI"/>
-          <w:color w:val="212121"/>
-        </w:rPr>
-        <w:t xml:space="preserve">Munir KM. Recognizing Grief in Neurodivergent Minds. JAMA Psychiatry. 2026;83(2):116-117. </w:t>
-      </w:r>
-      <w:proofErr w:type="spellStart"/>
-      <w:r>
-        <w:rPr>
-          <w:rFonts w:ascii="Segoe UI" w:hAnsi="Segoe UI" w:cs="Segoe UI"/>
-          <w:color w:val="212121"/>
-        </w:rPr>
-        <w:t>doi</w:t>
-      </w:r>
-      <w:proofErr w:type="spellEnd"/>
-      <w:r>
-        <w:rPr>
-          <w:rFonts w:ascii="Segoe UI" w:hAnsi="Segoe UI" w:cs="Segoe UI"/>
-          <w:color w:val="212121"/>
-        </w:rPr>
-        <w:t xml:space="preserve">: 10.1001/jamapsychiatry.2025.4225 </w:t>
-      </w:r>
-      <w:hyperlink r:id="rId39" w:history="1">
-        <w:r>
-          <w:rPr>
-            <w:rStyle w:val="Hyperlink"/>
-            <w:rFonts w:ascii="Segoe UI" w:hAnsi="Segoe UI" w:cs="Segoe UI"/>
-          </w:rPr>
-          <w:t>PMID: 41432942</w:t>
-        </w:r>
-      </w:hyperlink>
-      <w:r>
-        <w:rPr>
-          <w:rFonts w:ascii="Segoe UI" w:hAnsi="Segoe UI" w:cs="Segoe UI"/>
-          <w:color w:val="212121"/>
-        </w:rPr>
-        <w:t>.</w:t>
-      </w:r>
-    </w:p>
-    <w:p>
-      <w:pPr>
-        <w:pStyle w:val="NormalWeb"/>
-        <w:shd w:val="clear" w:color="auto" w:fill="FFFFFF"/>
-      </w:pPr>
-      <w:r>
-        <w:rPr>
-          <w:rFonts w:ascii="Segoe UI" w:hAnsi="Segoe UI" w:cs="Segoe UI"/>
-          <w:color w:val="212121"/>
-        </w:rPr>
-        <w:t>This Viewpoint discusses the trajectories of grief in neurodivergent individuals and how clinicians must assess changes from baseline rather than applying criteria without context and distinguish between grief-related functional decline and loss of adaptive support after a caregiver's death.</w:t>
-      </w:r>
-    </w:p>
-    <w:p>
-      <w:pPr>
-        <w:shd w:val="clear" w:color="auto" w:fill="FFFFFF"/>
-        <w:spacing w:after="0" w:line="240" w:lineRule="auto"/>
-      </w:pPr>
-    </w:p>
-    <w:p>
-      <w:pPr>
-        <w:pStyle w:val="Heading1"/>
-        <w:shd w:val="clear" w:color="auto" w:fill="FFFFFF"/>
-      </w:pPr>
-      <w:r>
-        <w:rPr>
-          <w:rFonts w:ascii="Merriweather" w:hAnsi="Merriweather"/>
-          <w:color w:val="212121"/>
-        </w:rPr>
         <w:t>Dopamine-Blocking Antipsychotics-Time for a New Conversation With Patients?</w:t>
       </w:r>
     </w:p>
@@ -4010,7 +4099,6 @@
           <w:rFonts w:ascii="Segoe UI" w:hAnsi="Segoe UI" w:cs="Segoe UI"/>
           <w:color w:val="212121"/>
         </w:rPr>
-        <w:lastRenderedPageBreak/>
         <w:t xml:space="preserve">Marder SR, Ostlund S. Dopamine-Blocking Antipsychotics-Time for a New Conversation </w:t>
       </w:r>
       <w:proofErr w:type="gramStart"/>
@@ -4521,7 +4609,6 @@
   <w:style w:type="character" w:default="1" w:styleId="DefaultParagraphFont">
     <w:name w:val="Default Paragraph Font"/>
     <w:uiPriority w:val="1"/>
-    <w:semiHidden/>
     <w:unhideWhenUsed/>
   </w:style>
   <w:style w:type="table" w:default="1" w:styleId="TableNormal">
@@ -4589,6 +4676,18 @@
     <w:rPr>
       <w:b/>
       <w:bCs/>
+    </w:rPr>
+  </w:style>
+  <w:style w:type="character" w:styleId="FollowedHyperlink">
+    <w:name w:val="FollowedHyperlink"/>
+    <w:basedOn w:val="DefaultParagraphFont"/>
+    <w:uiPriority w:val="99"/>
+    <w:semiHidden/>
+    <w:unhideWhenUsed/>
+    <w:rsid w:val="00B9526E"/>
+    <w:rPr>
+      <w:color w:val="96607D" w:themeColor="followedHyperlink"/>
+      <w:u w:val="single"/>
     </w:rPr>
   </w:style>
 </w:styles>

</xml_diff>